<commit_message>
Updated the Consortium Epic Hypothesis Statement
</commit_message>
<xml_diff>
--- a/docs/2_Value_Creation/2a_Product/AccelRR8_Consortium_NonProfit_Services_Portfolio_Epic-Hypothesis-Statement.docx
+++ b/docs/2_Value_Creation/2a_Product/AccelRR8_Consortium_NonProfit_Services_Portfolio_Epic-Hypothesis-Statement.docx
@@ -452,7 +452,7 @@
                 <w:sz w:val="22"/>
                 <w:szCs w:val="22"/>
               </w:rPr>
-              <w:t>are aligned with our values</w:t>
+              <w:t>are aligned with our values,</w:t>
             </w:r>
           </w:p>
           <w:p>
@@ -508,20 +508,21 @@
                 <w:sz w:val="22"/>
                 <w:szCs w:val="22"/>
               </w:rPr>
-              <w:t>is a</w:t>
-            </w:r>
-            <w:r>
-              <w:rPr>
-                <w:rFonts w:ascii="Arial" w:hAnsi="Arial" w:cs="Arial"/>
-                <w:sz w:val="22"/>
-                <w:szCs w:val="22"/>
-              </w:rPr>
-              <w:t xml:space="preserve"> </w:t>
-            </w:r>
-            <w:r>
-              <w:rPr>
-                <w:rFonts w:ascii="Arial" w:hAnsi="Arial" w:cs="Arial"/>
-                <w:color w:val="000000" w:themeColor="text1"/>
+              <w:t xml:space="preserve">is </w:t>
+            </w:r>
+            <w:r>
+              <w:rPr>
+                <w:rFonts w:ascii="Arial" w:hAnsi="Arial" w:cs="Arial"/>
+                <w:b/>
+                <w:bCs/>
+                <w:sz w:val="22"/>
+                <w:szCs w:val="22"/>
+              </w:rPr>
+              <w:t xml:space="preserve">a </w:t>
+            </w:r>
+            <w:r>
+              <w:rPr>
+                <w:rFonts w:ascii="Arial" w:hAnsi="Arial" w:cs="Arial"/>
                 <w:sz w:val="22"/>
                 <w:szCs w:val="22"/>
               </w:rPr>
@@ -561,26 +562,7 @@
                 <w:sz w:val="22"/>
                 <w:szCs w:val="22"/>
               </w:rPr>
-              <w:t xml:space="preserve">helps Tech Services industry leaders harness proven accelerators, mathematically capable of generating exponential results, to </w:t>
-            </w:r>
-            <w:r>
-              <w:rPr>
-                <w:rFonts w:ascii="Arial" w:hAnsi="Arial" w:cs="Arial"/>
-                <w:b/>
-                <w:bCs/>
-                <w:color w:val="00B050"/>
-                <w:sz w:val="22"/>
-                <w:szCs w:val="22"/>
-              </w:rPr>
-              <w:t>grow value exponentially at scale</w:t>
-            </w:r>
-            <w:r>
-              <w:rPr>
-                <w:rFonts w:ascii="Arial" w:hAnsi="Arial" w:cs="Arial"/>
-                <w:sz w:val="22"/>
-                <w:szCs w:val="22"/>
-              </w:rPr>
-              <w:t>.</w:t>
+              <w:t>helps Tech Services industry leaders harness proven accelerators, mathematically capable of generating exponential results, to grow value exponentially at scale.</w:t>
             </w:r>
           </w:p>
           <w:p>
@@ -612,60 +594,11 @@
             </w:r>
             <w:r>
               <w:rPr>
-                <w:rFonts w:eastAsiaTheme="minorEastAsia" w:hAnsi="Arial"/>
-                <w:color w:val="000000" w:themeColor="text1"/>
-                <w:sz w:val="28"/>
-                <w:szCs w:val="28"/>
-              </w:rPr>
-              <w:t xml:space="preserve"> </w:t>
-            </w:r>
-            <w:r>
-              <w:rPr>
-                <w:rFonts w:ascii="Arial" w:hAnsi="Arial" w:cs="Arial"/>
-                <w:sz w:val="22"/>
-                <w:szCs w:val="22"/>
-              </w:rPr>
-              <w:t>non-profits oriented on roles</w:t>
-            </w:r>
-            <w:r>
-              <w:rPr>
-                <w:rFonts w:ascii="Arial" w:hAnsi="Arial" w:cs="Arial"/>
-                <w:sz w:val="22"/>
-                <w:szCs w:val="22"/>
-              </w:rPr>
-              <w:t>,</w:t>
-            </w:r>
-            <w:r>
-              <w:rPr>
-                <w:rFonts w:ascii="Arial" w:hAnsi="Arial" w:cs="Arial"/>
-                <w:sz w:val="22"/>
-                <w:szCs w:val="22"/>
-              </w:rPr>
-              <w:t xml:space="preserve"> groups</w:t>
-            </w:r>
-            <w:r>
-              <w:rPr>
-                <w:rFonts w:ascii="Arial" w:hAnsi="Arial" w:cs="Arial"/>
-                <w:sz w:val="22"/>
-                <w:szCs w:val="22"/>
-              </w:rPr>
-              <w:t>,</w:t>
-            </w:r>
-            <w:r>
-              <w:rPr>
-                <w:rFonts w:ascii="Arial" w:hAnsi="Arial" w:cs="Arial"/>
-                <w:sz w:val="22"/>
-                <w:szCs w:val="22"/>
-              </w:rPr>
-              <w:t xml:space="preserve"> or industr</w:t>
-            </w:r>
-            <w:r>
-              <w:rPr>
-                <w:rFonts w:ascii="Arial" w:hAnsi="Arial" w:cs="Arial"/>
-                <w:sz w:val="22"/>
-                <w:szCs w:val="22"/>
-              </w:rPr>
-              <w:t>ies</w:t>
+                <w:rFonts w:ascii="Arial" w:hAnsi="Arial" w:cs="Arial"/>
+                <w:sz w:val="22"/>
+                <w:szCs w:val="22"/>
+              </w:rPr>
+              <w:t>non-profits oriented on roles, groups, or industries,</w:t>
             </w:r>
           </w:p>
           <w:p>
@@ -711,26 +644,7 @@
                 <w:sz w:val="22"/>
                 <w:szCs w:val="22"/>
               </w:rPr>
-              <w:t xml:space="preserve">is goal-oriented – focused on helping Tech Services industry leaders work together to </w:t>
-            </w:r>
-            <w:r>
-              <w:rPr>
-                <w:rFonts w:ascii="Arial" w:hAnsi="Arial" w:cs="Arial"/>
-                <w:b/>
-                <w:bCs/>
-                <w:color w:val="00B050"/>
-                <w:sz w:val="22"/>
-                <w:szCs w:val="22"/>
-              </w:rPr>
-              <w:t>accelerate success</w:t>
-            </w:r>
-            <w:r>
-              <w:rPr>
-                <w:rFonts w:ascii="Arial" w:hAnsi="Arial" w:cs="Arial"/>
-                <w:sz w:val="22"/>
-                <w:szCs w:val="22"/>
-              </w:rPr>
-              <w:t xml:space="preserve"> for themselves, their industry, and all humanity.</w:t>
+              <w:t>is goal-oriented – its services are focused on helping Tech Services industry leaders work together to accelerate success for themselves, their industry, and all humanity.</w:t>
             </w:r>
           </w:p>
         </w:tc>
@@ -849,7 +763,7 @@
                 <w:sz w:val="22"/>
                 <w:szCs w:val="22"/>
               </w:rPr>
-              <w:t xml:space="preserve"> improve their professional network, skills, and career opportunities</w:t>
+              <w:t xml:space="preserve"> improve their professional network, skills, and opportunities as measured via survey of collaborators</w:t>
             </w:r>
           </w:p>
           <w:p>
@@ -885,7 +799,7 @@
                 <w:sz w:val="22"/>
                 <w:szCs w:val="22"/>
               </w:rPr>
-              <w:t xml:space="preserve"> exponentially better services and benefits to humanity</w:t>
+              <w:t xml:space="preserve"> exponentially better services and benefits to humanity as measured via survey of collaborators</w:t>
             </w:r>
           </w:p>
           <w:p>
@@ -894,15 +808,9 @@
                 <w:ilvl w:val="0"/>
                 <w:numId w:val="1"/>
               </w:numPr>
-              <w:tabs>
-                <w:tab w:val="clear" w:pos="360"/>
-                <w:tab w:val="num" w:pos="720"/>
-              </w:tabs>
               <w:spacing w:before="120"/>
               <w:rPr>
                 <w:rFonts w:ascii="Arial" w:hAnsi="Arial" w:cs="Arial"/>
-                <w:b/>
-                <w:bCs/>
                 <w:sz w:val="22"/>
                 <w:szCs w:val="22"/>
               </w:rPr>
@@ -915,15 +823,15 @@
                 <w:sz w:val="22"/>
                 <w:szCs w:val="22"/>
               </w:rPr>
-              <w:t>Our Consortium:</w:t>
-            </w:r>
-            <w:r>
-              <w:rPr>
-                <w:rFonts w:ascii="Arial" w:hAnsi="Arial" w:cs="Arial"/>
-                <w:sz w:val="22"/>
-                <w:szCs w:val="22"/>
-              </w:rPr>
-              <w:t xml:space="preserve"> exponentially better services and benefits for Tech services leaders, their industry, and humanity</w:t>
+              <w:t>AccelRR8 Consortium:</w:t>
+            </w:r>
+            <w:r>
+              <w:rPr>
+                <w:rFonts w:ascii="Arial" w:hAnsi="Arial" w:cs="Arial"/>
+                <w:sz w:val="22"/>
+                <w:szCs w:val="22"/>
+              </w:rPr>
+              <w:t xml:space="preserve"> exponentially better services and benefits for Tech services leaders, their industry, and humanity as measured via survey of collaborators</w:t>
             </w:r>
           </w:p>
         </w:tc>
@@ -987,12 +895,8 @@
             <w:pPr>
               <w:numPr>
                 <w:ilvl w:val="0"/>
-                <w:numId w:val="5"/>
+                <w:numId w:val="6"/>
               </w:numPr>
-              <w:tabs>
-                <w:tab w:val="clear" w:pos="360"/>
-                <w:tab w:val="num" w:pos="720"/>
-              </w:tabs>
               <w:spacing w:before="120"/>
               <w:rPr>
                 <w:rFonts w:ascii="Arial" w:hAnsi="Arial" w:cs="Arial"/>
@@ -1006,14 +910,14 @@
                 <w:sz w:val="22"/>
                 <w:szCs w:val="22"/>
               </w:rPr>
-              <w:t>MVP versions of the Professional Networking, Open Knowledge Sharing, and Industry Innovation offerings</w:t>
+              <w:t>MVP versions of the Professional Networking, Open Knowledge Sharing, and Industry Innovation Services</w:t>
             </w:r>
           </w:p>
           <w:p>
             <w:pPr>
               <w:numPr>
                 <w:ilvl w:val="0"/>
-                <w:numId w:val="5"/>
+                <w:numId w:val="6"/>
               </w:numPr>
               <w:spacing w:before="120"/>
               <w:rPr>
@@ -1028,23 +932,7 @@
                 <w:sz w:val="22"/>
                 <w:szCs w:val="22"/>
               </w:rPr>
-              <w:t xml:space="preserve">1000 </w:t>
-            </w:r>
-            <w:r>
-              <w:rPr>
-                <w:rFonts w:ascii="Arial" w:hAnsi="Arial" w:cs="Arial"/>
-                <w:sz w:val="22"/>
-                <w:szCs w:val="22"/>
-              </w:rPr>
-              <w:t>subscribers</w:t>
-            </w:r>
-            <w:r>
-              <w:rPr>
-                <w:rFonts w:ascii="Arial" w:hAnsi="Arial" w:cs="Arial"/>
-                <w:sz w:val="22"/>
-                <w:szCs w:val="22"/>
-              </w:rPr>
-              <w:t xml:space="preserve"> who are net promoters of the AccelRR8 Consortium</w:t>
+              <w:t>1000 subscribers who are net promoters</w:t>
             </w:r>
           </w:p>
         </w:tc>
@@ -1254,15 +1142,15 @@
                 <w:sz w:val="22"/>
                 <w:szCs w:val="22"/>
               </w:rPr>
-              <w:t>Consortium’s</w:t>
-            </w:r>
-            <w:r>
-              <w:rPr>
-                <w:rFonts w:ascii="Arial" w:hAnsi="Arial" w:cs="Arial"/>
-                <w:sz w:val="22"/>
-                <w:szCs w:val="22"/>
-              </w:rPr>
-              <w:t xml:space="preserve"> own success will be a key proof of our core premise, creating a virtuous cycle</w:t>
+              <w:t>organization</w:t>
+            </w:r>
+            <w:r>
+              <w:rPr>
+                <w:rFonts w:ascii="Arial" w:hAnsi="Arial" w:cs="Arial"/>
+                <w:sz w:val="22"/>
+                <w:szCs w:val="22"/>
+              </w:rPr>
+              <w:t>’s own success will be a key proof of our core premise, creating a virtuous cycle</w:t>
             </w:r>
           </w:p>
           <w:p>
@@ -1294,31 +1182,15 @@
                 <w:sz w:val="22"/>
                 <w:szCs w:val="22"/>
               </w:rPr>
-              <w:t xml:space="preserve"> </w:t>
-            </w:r>
-            <w:r>
-              <w:rPr>
-                <w:rFonts w:ascii="Arial" w:hAnsi="Arial" w:cs="Arial"/>
-                <w:sz w:val="22"/>
-                <w:szCs w:val="22"/>
-              </w:rPr>
-              <w:t>becoming and remaining a subscriber, patron</w:t>
-            </w:r>
-            <w:r>
-              <w:rPr>
-                <w:rFonts w:ascii="Arial" w:hAnsi="Arial" w:cs="Arial"/>
-                <w:sz w:val="22"/>
-                <w:szCs w:val="22"/>
-              </w:rPr>
-              <w:t>, and/or Consortium leader</w:t>
-            </w:r>
-            <w:r>
-              <w:rPr>
-                <w:rFonts w:ascii="Arial" w:hAnsi="Arial" w:cs="Arial"/>
-                <w:sz w:val="22"/>
-                <w:szCs w:val="22"/>
-              </w:rPr>
-              <w:t xml:space="preserve"> must be incredibly easy</w:t>
+              <w:t xml:space="preserve">  </w:t>
+            </w:r>
+            <w:r>
+              <w:rPr>
+                <w:rFonts w:ascii="Arial" w:hAnsi="Arial" w:cs="Arial"/>
+                <w:sz w:val="22"/>
+                <w:szCs w:val="22"/>
+              </w:rPr>
+              <w:t>becoming and remaining a subscriber, patron, and/or Consortium leader must be incredibly easy</w:t>
             </w:r>
           </w:p>
         </w:tc>
@@ -1351,6 +1223,7 @@
           <w:sz w:val="16"/>
           <w:szCs w:val="16"/>
         </w:rPr>
+        <w:lastRenderedPageBreak/>
         <w:sym w:font="Symbol" w:char="F0D3"/>
       </w:r>
       <w:r>
@@ -1517,146 +1390,6 @@
 <file path=word/numbering.xml><?xml version="1.0" encoding="utf-8"?>
 <w:numbering xmlns:wpc="http://schemas.microsoft.com/office/word/2010/wordprocessingCanvas" xmlns:cx="http://schemas.microsoft.com/office/drawing/2014/chartex" xmlns:cx1="http://schemas.microsoft.com/office/drawing/2015/9/8/chartex" xmlns:cx2="http://schemas.microsoft.com/office/drawing/2015/10/21/chartex" xmlns:cx3="http://schemas.microsoft.com/office/drawing/2016/5/9/chartex" xmlns:cx4="http://schemas.microsoft.com/office/drawing/2016/5/10/chartex" xmlns:cx5="http://schemas.microsoft.com/office/drawing/2016/5/11/chartex" xmlns:cx6="http://schemas.microsoft.com/office/drawing/2016/5/12/chartex" xmlns:cx7="http://schemas.microsoft.com/office/drawing/2016/5/13/chartex" xmlns:cx8="http://schemas.microsoft.com/office/drawing/2016/5/14/chartex" xmlns:mc="http://schemas.openxmlformats.org/markup-compatibility/2006" xmlns:aink="http://schemas.microsoft.com/office/drawing/2016/ink" xmlns:am3d="http://schemas.microsoft.com/office/drawing/2017/model3d" xmlns:o="urn:schemas-microsoft-com:office:office" xmlns:oel="http://schemas.microsoft.com/office/2019/extlst" xmlns:r="http://schemas.openxmlformats.org/officeDocument/2006/relationships" xmlns:m="http://schemas.openxmlformats.org/officeDocument/2006/math" xmlns:v="urn:schemas-microsoft-com:vml" xmlns:wp14="http://schemas.microsoft.com/office/word/2010/wordprocessingDrawing" xmlns:wp="http://schemas.openxmlformats.org/drawingml/2006/wordprocessingDrawing" xmlns:w10="urn:schemas-microsoft-com:office:word" xmlns:w="http://schemas.openxmlformats.org/wordprocessingml/2006/main" xmlns:w14="http://schemas.microsoft.com/office/word/2010/wordml" xmlns:w15="http://schemas.microsoft.com/office/word/2012/wordml" xmlns:w16cex="http://schemas.microsoft.com/office/word/2018/wordml/cex" xmlns:w16cid="http://schemas.microsoft.com/office/word/2016/wordml/cid" xmlns:w16="http://schemas.microsoft.com/office/word/2018/wordml" xmlns:w16du="http://schemas.microsoft.com/office/word/2023/wordml/word16du" xmlns:w16sdtdh="http://schemas.microsoft.com/office/word/2020/wordml/sdtdatahash" xmlns:w16sdtfl="http://schemas.microsoft.com/office/word/2024/wordml/sdtformatlock" xmlns:w16se="http://schemas.microsoft.com/office/word/2015/wordml/symex" xmlns:wpg="http://schemas.microsoft.com/office/word/2010/wordprocessingGroup" xmlns:wpi="http://schemas.microsoft.com/office/word/2010/wordprocessingInk" xmlns:wne="http://schemas.microsoft.com/office/word/2006/wordml" xmlns:wps="http://schemas.microsoft.com/office/word/2010/wordprocessingShape" mc:Ignorable="w14 w15 w16se w16cid w16 w16cex w16sdtdh w16sdtfl w16du wp14">
   <w:abstractNum w:abstractNumId="0" w15:restartNumberingAfterBreak="0">
-    <w:nsid w:val="011E0890"/>
-    <w:multiLevelType w:val="hybridMultilevel"/>
-    <w:tmpl w:val="34FAE41A"/>
-    <w:lvl w:ilvl="0" w:tplc="4EB2848A">
-      <w:start w:val="1"/>
-      <w:numFmt w:val="bullet"/>
-      <w:lvlText w:val="•"/>
-      <w:lvlJc w:val="left"/>
-      <w:pPr>
-        <w:tabs>
-          <w:tab w:val="num" w:pos="360"/>
-        </w:tabs>
-        <w:ind w:left="360" w:hanging="360"/>
-      </w:pPr>
-      <w:rPr>
-        <w:rFonts w:ascii="Arial" w:hAnsi="Arial" w:hint="default"/>
-      </w:rPr>
-    </w:lvl>
-    <w:lvl w:ilvl="1" w:tplc="2A9AA576" w:tentative="1">
-      <w:start w:val="1"/>
-      <w:numFmt w:val="bullet"/>
-      <w:lvlText w:val="•"/>
-      <w:lvlJc w:val="left"/>
-      <w:pPr>
-        <w:tabs>
-          <w:tab w:val="num" w:pos="1080"/>
-        </w:tabs>
-        <w:ind w:left="1080" w:hanging="360"/>
-      </w:pPr>
-      <w:rPr>
-        <w:rFonts w:ascii="Arial" w:hAnsi="Arial" w:hint="default"/>
-      </w:rPr>
-    </w:lvl>
-    <w:lvl w:ilvl="2" w:tplc="48D8122C" w:tentative="1">
-      <w:start w:val="1"/>
-      <w:numFmt w:val="bullet"/>
-      <w:lvlText w:val="•"/>
-      <w:lvlJc w:val="left"/>
-      <w:pPr>
-        <w:tabs>
-          <w:tab w:val="num" w:pos="1800"/>
-        </w:tabs>
-        <w:ind w:left="1800" w:hanging="360"/>
-      </w:pPr>
-      <w:rPr>
-        <w:rFonts w:ascii="Arial" w:hAnsi="Arial" w:hint="default"/>
-      </w:rPr>
-    </w:lvl>
-    <w:lvl w:ilvl="3" w:tplc="A6DE4440" w:tentative="1">
-      <w:start w:val="1"/>
-      <w:numFmt w:val="bullet"/>
-      <w:lvlText w:val="•"/>
-      <w:lvlJc w:val="left"/>
-      <w:pPr>
-        <w:tabs>
-          <w:tab w:val="num" w:pos="2520"/>
-        </w:tabs>
-        <w:ind w:left="2520" w:hanging="360"/>
-      </w:pPr>
-      <w:rPr>
-        <w:rFonts w:ascii="Arial" w:hAnsi="Arial" w:hint="default"/>
-      </w:rPr>
-    </w:lvl>
-    <w:lvl w:ilvl="4" w:tplc="CFD00CA2" w:tentative="1">
-      <w:start w:val="1"/>
-      <w:numFmt w:val="bullet"/>
-      <w:lvlText w:val="•"/>
-      <w:lvlJc w:val="left"/>
-      <w:pPr>
-        <w:tabs>
-          <w:tab w:val="num" w:pos="3240"/>
-        </w:tabs>
-        <w:ind w:left="3240" w:hanging="360"/>
-      </w:pPr>
-      <w:rPr>
-        <w:rFonts w:ascii="Arial" w:hAnsi="Arial" w:hint="default"/>
-      </w:rPr>
-    </w:lvl>
-    <w:lvl w:ilvl="5" w:tplc="08608D66" w:tentative="1">
-      <w:start w:val="1"/>
-      <w:numFmt w:val="bullet"/>
-      <w:lvlText w:val="•"/>
-      <w:lvlJc w:val="left"/>
-      <w:pPr>
-        <w:tabs>
-          <w:tab w:val="num" w:pos="3960"/>
-        </w:tabs>
-        <w:ind w:left="3960" w:hanging="360"/>
-      </w:pPr>
-      <w:rPr>
-        <w:rFonts w:ascii="Arial" w:hAnsi="Arial" w:hint="default"/>
-      </w:rPr>
-    </w:lvl>
-    <w:lvl w:ilvl="6" w:tplc="11AA2ADC" w:tentative="1">
-      <w:start w:val="1"/>
-      <w:numFmt w:val="bullet"/>
-      <w:lvlText w:val="•"/>
-      <w:lvlJc w:val="left"/>
-      <w:pPr>
-        <w:tabs>
-          <w:tab w:val="num" w:pos="4680"/>
-        </w:tabs>
-        <w:ind w:left="4680" w:hanging="360"/>
-      </w:pPr>
-      <w:rPr>
-        <w:rFonts w:ascii="Arial" w:hAnsi="Arial" w:hint="default"/>
-      </w:rPr>
-    </w:lvl>
-    <w:lvl w:ilvl="7" w:tplc="96C0BF3A" w:tentative="1">
-      <w:start w:val="1"/>
-      <w:numFmt w:val="bullet"/>
-      <w:lvlText w:val="•"/>
-      <w:lvlJc w:val="left"/>
-      <w:pPr>
-        <w:tabs>
-          <w:tab w:val="num" w:pos="5400"/>
-        </w:tabs>
-        <w:ind w:left="5400" w:hanging="360"/>
-      </w:pPr>
-      <w:rPr>
-        <w:rFonts w:ascii="Arial" w:hAnsi="Arial" w:hint="default"/>
-      </w:rPr>
-    </w:lvl>
-    <w:lvl w:ilvl="8" w:tplc="B6FA43E2" w:tentative="1">
-      <w:start w:val="1"/>
-      <w:numFmt w:val="bullet"/>
-      <w:lvlText w:val="•"/>
-      <w:lvlJc w:val="left"/>
-      <w:pPr>
-        <w:tabs>
-          <w:tab w:val="num" w:pos="6120"/>
-        </w:tabs>
-        <w:ind w:left="6120" w:hanging="360"/>
-      </w:pPr>
-      <w:rPr>
-        <w:rFonts w:ascii="Arial" w:hAnsi="Arial" w:hint="default"/>
-      </w:rPr>
-    </w:lvl>
-  </w:abstractNum>
-  <w:abstractNum w:abstractNumId="1" w15:restartNumberingAfterBreak="0">
     <w:nsid w:val="01FC5751"/>
     <w:multiLevelType w:val="hybridMultilevel"/>
     <w:tmpl w:val="1CC296B6"/>
@@ -1796,7 +1529,400 @@
       </w:rPr>
     </w:lvl>
   </w:abstractNum>
+  <w:abstractNum w:abstractNumId="1" w15:restartNumberingAfterBreak="0">
+    <w:nsid w:val="100E11B8"/>
+    <w:multiLevelType w:val="hybridMultilevel"/>
+    <w:tmpl w:val="E1D2E51A"/>
+    <w:lvl w:ilvl="0" w:tplc="9C5887FA">
+      <w:start w:val="1"/>
+      <w:numFmt w:val="bullet"/>
+      <w:lvlText w:val="•"/>
+      <w:lvlJc w:val="left"/>
+      <w:pPr>
+        <w:tabs>
+          <w:tab w:val="num" w:pos="360"/>
+        </w:tabs>
+        <w:ind w:left="360" w:hanging="360"/>
+      </w:pPr>
+      <w:rPr>
+        <w:rFonts w:ascii="Arial" w:hAnsi="Arial" w:hint="default"/>
+      </w:rPr>
+    </w:lvl>
+    <w:lvl w:ilvl="1" w:tplc="0FBACEF6" w:tentative="1">
+      <w:start w:val="1"/>
+      <w:numFmt w:val="bullet"/>
+      <w:lvlText w:val="•"/>
+      <w:lvlJc w:val="left"/>
+      <w:pPr>
+        <w:tabs>
+          <w:tab w:val="num" w:pos="1080"/>
+        </w:tabs>
+        <w:ind w:left="1080" w:hanging="360"/>
+      </w:pPr>
+      <w:rPr>
+        <w:rFonts w:ascii="Arial" w:hAnsi="Arial" w:hint="default"/>
+      </w:rPr>
+    </w:lvl>
+    <w:lvl w:ilvl="2" w:tplc="452ABA44" w:tentative="1">
+      <w:start w:val="1"/>
+      <w:numFmt w:val="bullet"/>
+      <w:lvlText w:val="•"/>
+      <w:lvlJc w:val="left"/>
+      <w:pPr>
+        <w:tabs>
+          <w:tab w:val="num" w:pos="1800"/>
+        </w:tabs>
+        <w:ind w:left="1800" w:hanging="360"/>
+      </w:pPr>
+      <w:rPr>
+        <w:rFonts w:ascii="Arial" w:hAnsi="Arial" w:hint="default"/>
+      </w:rPr>
+    </w:lvl>
+    <w:lvl w:ilvl="3" w:tplc="4BE4E1E0" w:tentative="1">
+      <w:start w:val="1"/>
+      <w:numFmt w:val="bullet"/>
+      <w:lvlText w:val="•"/>
+      <w:lvlJc w:val="left"/>
+      <w:pPr>
+        <w:tabs>
+          <w:tab w:val="num" w:pos="2520"/>
+        </w:tabs>
+        <w:ind w:left="2520" w:hanging="360"/>
+      </w:pPr>
+      <w:rPr>
+        <w:rFonts w:ascii="Arial" w:hAnsi="Arial" w:hint="default"/>
+      </w:rPr>
+    </w:lvl>
+    <w:lvl w:ilvl="4" w:tplc="E7C05A2A" w:tentative="1">
+      <w:start w:val="1"/>
+      <w:numFmt w:val="bullet"/>
+      <w:lvlText w:val="•"/>
+      <w:lvlJc w:val="left"/>
+      <w:pPr>
+        <w:tabs>
+          <w:tab w:val="num" w:pos="3240"/>
+        </w:tabs>
+        <w:ind w:left="3240" w:hanging="360"/>
+      </w:pPr>
+      <w:rPr>
+        <w:rFonts w:ascii="Arial" w:hAnsi="Arial" w:hint="default"/>
+      </w:rPr>
+    </w:lvl>
+    <w:lvl w:ilvl="5" w:tplc="66DC769C" w:tentative="1">
+      <w:start w:val="1"/>
+      <w:numFmt w:val="bullet"/>
+      <w:lvlText w:val="•"/>
+      <w:lvlJc w:val="left"/>
+      <w:pPr>
+        <w:tabs>
+          <w:tab w:val="num" w:pos="3960"/>
+        </w:tabs>
+        <w:ind w:left="3960" w:hanging="360"/>
+      </w:pPr>
+      <w:rPr>
+        <w:rFonts w:ascii="Arial" w:hAnsi="Arial" w:hint="default"/>
+      </w:rPr>
+    </w:lvl>
+    <w:lvl w:ilvl="6" w:tplc="C412A036" w:tentative="1">
+      <w:start w:val="1"/>
+      <w:numFmt w:val="bullet"/>
+      <w:lvlText w:val="•"/>
+      <w:lvlJc w:val="left"/>
+      <w:pPr>
+        <w:tabs>
+          <w:tab w:val="num" w:pos="4680"/>
+        </w:tabs>
+        <w:ind w:left="4680" w:hanging="360"/>
+      </w:pPr>
+      <w:rPr>
+        <w:rFonts w:ascii="Arial" w:hAnsi="Arial" w:hint="default"/>
+      </w:rPr>
+    </w:lvl>
+    <w:lvl w:ilvl="7" w:tplc="BE509446" w:tentative="1">
+      <w:start w:val="1"/>
+      <w:numFmt w:val="bullet"/>
+      <w:lvlText w:val="•"/>
+      <w:lvlJc w:val="left"/>
+      <w:pPr>
+        <w:tabs>
+          <w:tab w:val="num" w:pos="5400"/>
+        </w:tabs>
+        <w:ind w:left="5400" w:hanging="360"/>
+      </w:pPr>
+      <w:rPr>
+        <w:rFonts w:ascii="Arial" w:hAnsi="Arial" w:hint="default"/>
+      </w:rPr>
+    </w:lvl>
+    <w:lvl w:ilvl="8" w:tplc="D33EA3B2" w:tentative="1">
+      <w:start w:val="1"/>
+      <w:numFmt w:val="bullet"/>
+      <w:lvlText w:val="•"/>
+      <w:lvlJc w:val="left"/>
+      <w:pPr>
+        <w:tabs>
+          <w:tab w:val="num" w:pos="6120"/>
+        </w:tabs>
+        <w:ind w:left="6120" w:hanging="360"/>
+      </w:pPr>
+      <w:rPr>
+        <w:rFonts w:ascii="Arial" w:hAnsi="Arial" w:hint="default"/>
+      </w:rPr>
+    </w:lvl>
+  </w:abstractNum>
   <w:abstractNum w:abstractNumId="2" w15:restartNumberingAfterBreak="0">
+    <w:nsid w:val="193258F3"/>
+    <w:multiLevelType w:val="hybridMultilevel"/>
+    <w:tmpl w:val="A4524A0A"/>
+    <w:lvl w:ilvl="0" w:tplc="04190005">
+      <w:start w:val="1"/>
+      <w:numFmt w:val="bullet"/>
+      <w:lvlText w:val=""/>
+      <w:lvlJc w:val="left"/>
+      <w:pPr>
+        <w:ind w:left="720" w:hanging="360"/>
+      </w:pPr>
+      <w:rPr>
+        <w:rFonts w:ascii="Wingdings" w:hAnsi="Wingdings" w:hint="default"/>
+      </w:rPr>
+    </w:lvl>
+    <w:lvl w:ilvl="1" w:tplc="04190003" w:tentative="1">
+      <w:start w:val="1"/>
+      <w:numFmt w:val="bullet"/>
+      <w:lvlText w:val="o"/>
+      <w:lvlJc w:val="left"/>
+      <w:pPr>
+        <w:ind w:left="1440" w:hanging="360"/>
+      </w:pPr>
+      <w:rPr>
+        <w:rFonts w:ascii="Courier New" w:hAnsi="Courier New" w:cs="Courier New" w:hint="default"/>
+      </w:rPr>
+    </w:lvl>
+    <w:lvl w:ilvl="2" w:tplc="04190005" w:tentative="1">
+      <w:start w:val="1"/>
+      <w:numFmt w:val="bullet"/>
+      <w:lvlText w:val=""/>
+      <w:lvlJc w:val="left"/>
+      <w:pPr>
+        <w:ind w:left="2160" w:hanging="360"/>
+      </w:pPr>
+      <w:rPr>
+        <w:rFonts w:ascii="Wingdings" w:hAnsi="Wingdings" w:hint="default"/>
+      </w:rPr>
+    </w:lvl>
+    <w:lvl w:ilvl="3" w:tplc="04190001" w:tentative="1">
+      <w:start w:val="1"/>
+      <w:numFmt w:val="bullet"/>
+      <w:lvlText w:val=""/>
+      <w:lvlJc w:val="left"/>
+      <w:pPr>
+        <w:ind w:left="2880" w:hanging="360"/>
+      </w:pPr>
+      <w:rPr>
+        <w:rFonts w:ascii="Symbol" w:hAnsi="Symbol" w:hint="default"/>
+      </w:rPr>
+    </w:lvl>
+    <w:lvl w:ilvl="4" w:tplc="04190003" w:tentative="1">
+      <w:start w:val="1"/>
+      <w:numFmt w:val="bullet"/>
+      <w:lvlText w:val="o"/>
+      <w:lvlJc w:val="left"/>
+      <w:pPr>
+        <w:ind w:left="3600" w:hanging="360"/>
+      </w:pPr>
+      <w:rPr>
+        <w:rFonts w:ascii="Courier New" w:hAnsi="Courier New" w:cs="Courier New" w:hint="default"/>
+      </w:rPr>
+    </w:lvl>
+    <w:lvl w:ilvl="5" w:tplc="04190005" w:tentative="1">
+      <w:start w:val="1"/>
+      <w:numFmt w:val="bullet"/>
+      <w:lvlText w:val=""/>
+      <w:lvlJc w:val="left"/>
+      <w:pPr>
+        <w:ind w:left="4320" w:hanging="360"/>
+      </w:pPr>
+      <w:rPr>
+        <w:rFonts w:ascii="Wingdings" w:hAnsi="Wingdings" w:hint="default"/>
+      </w:rPr>
+    </w:lvl>
+    <w:lvl w:ilvl="6" w:tplc="04190001" w:tentative="1">
+      <w:start w:val="1"/>
+      <w:numFmt w:val="bullet"/>
+      <w:lvlText w:val=""/>
+      <w:lvlJc w:val="left"/>
+      <w:pPr>
+        <w:ind w:left="5040" w:hanging="360"/>
+      </w:pPr>
+      <w:rPr>
+        <w:rFonts w:ascii="Symbol" w:hAnsi="Symbol" w:hint="default"/>
+      </w:rPr>
+    </w:lvl>
+    <w:lvl w:ilvl="7" w:tplc="04190003" w:tentative="1">
+      <w:start w:val="1"/>
+      <w:numFmt w:val="bullet"/>
+      <w:lvlText w:val="o"/>
+      <w:lvlJc w:val="left"/>
+      <w:pPr>
+        <w:ind w:left="5760" w:hanging="360"/>
+      </w:pPr>
+      <w:rPr>
+        <w:rFonts w:ascii="Courier New" w:hAnsi="Courier New" w:cs="Courier New" w:hint="default"/>
+      </w:rPr>
+    </w:lvl>
+    <w:lvl w:ilvl="8" w:tplc="04190005" w:tentative="1">
+      <w:start w:val="1"/>
+      <w:numFmt w:val="bullet"/>
+      <w:lvlText w:val=""/>
+      <w:lvlJc w:val="left"/>
+      <w:pPr>
+        <w:ind w:left="6480" w:hanging="360"/>
+      </w:pPr>
+      <w:rPr>
+        <w:rFonts w:ascii="Wingdings" w:hAnsi="Wingdings" w:hint="default"/>
+      </w:rPr>
+    </w:lvl>
+  </w:abstractNum>
+  <w:abstractNum w:abstractNumId="3" w15:restartNumberingAfterBreak="0">
+    <w:nsid w:val="20674B76"/>
+    <w:multiLevelType w:val="hybridMultilevel"/>
+    <w:tmpl w:val="7688A2DC"/>
+    <w:lvl w:ilvl="0" w:tplc="4A4EEC68">
+      <w:start w:val="1"/>
+      <w:numFmt w:val="bullet"/>
+      <w:lvlText w:val="•"/>
+      <w:lvlJc w:val="left"/>
+      <w:pPr>
+        <w:tabs>
+          <w:tab w:val="num" w:pos="360"/>
+        </w:tabs>
+        <w:ind w:left="360" w:hanging="360"/>
+      </w:pPr>
+      <w:rPr>
+        <w:rFonts w:ascii="Arial" w:hAnsi="Arial" w:hint="default"/>
+      </w:rPr>
+    </w:lvl>
+    <w:lvl w:ilvl="1" w:tplc="149CFE6A" w:tentative="1">
+      <w:start w:val="1"/>
+      <w:numFmt w:val="bullet"/>
+      <w:lvlText w:val="•"/>
+      <w:lvlJc w:val="left"/>
+      <w:pPr>
+        <w:tabs>
+          <w:tab w:val="num" w:pos="1080"/>
+        </w:tabs>
+        <w:ind w:left="1080" w:hanging="360"/>
+      </w:pPr>
+      <w:rPr>
+        <w:rFonts w:ascii="Arial" w:hAnsi="Arial" w:hint="default"/>
+      </w:rPr>
+    </w:lvl>
+    <w:lvl w:ilvl="2" w:tplc="D80005AA" w:tentative="1">
+      <w:start w:val="1"/>
+      <w:numFmt w:val="bullet"/>
+      <w:lvlText w:val="•"/>
+      <w:lvlJc w:val="left"/>
+      <w:pPr>
+        <w:tabs>
+          <w:tab w:val="num" w:pos="1800"/>
+        </w:tabs>
+        <w:ind w:left="1800" w:hanging="360"/>
+      </w:pPr>
+      <w:rPr>
+        <w:rFonts w:ascii="Arial" w:hAnsi="Arial" w:hint="default"/>
+      </w:rPr>
+    </w:lvl>
+    <w:lvl w:ilvl="3" w:tplc="CDCA3B9A" w:tentative="1">
+      <w:start w:val="1"/>
+      <w:numFmt w:val="bullet"/>
+      <w:lvlText w:val="•"/>
+      <w:lvlJc w:val="left"/>
+      <w:pPr>
+        <w:tabs>
+          <w:tab w:val="num" w:pos="2520"/>
+        </w:tabs>
+        <w:ind w:left="2520" w:hanging="360"/>
+      </w:pPr>
+      <w:rPr>
+        <w:rFonts w:ascii="Arial" w:hAnsi="Arial" w:hint="default"/>
+      </w:rPr>
+    </w:lvl>
+    <w:lvl w:ilvl="4" w:tplc="E9EC8500" w:tentative="1">
+      <w:start w:val="1"/>
+      <w:numFmt w:val="bullet"/>
+      <w:lvlText w:val="•"/>
+      <w:lvlJc w:val="left"/>
+      <w:pPr>
+        <w:tabs>
+          <w:tab w:val="num" w:pos="3240"/>
+        </w:tabs>
+        <w:ind w:left="3240" w:hanging="360"/>
+      </w:pPr>
+      <w:rPr>
+        <w:rFonts w:ascii="Arial" w:hAnsi="Arial" w:hint="default"/>
+      </w:rPr>
+    </w:lvl>
+    <w:lvl w:ilvl="5" w:tplc="CFCEA7C6" w:tentative="1">
+      <w:start w:val="1"/>
+      <w:numFmt w:val="bullet"/>
+      <w:lvlText w:val="•"/>
+      <w:lvlJc w:val="left"/>
+      <w:pPr>
+        <w:tabs>
+          <w:tab w:val="num" w:pos="3960"/>
+        </w:tabs>
+        <w:ind w:left="3960" w:hanging="360"/>
+      </w:pPr>
+      <w:rPr>
+        <w:rFonts w:ascii="Arial" w:hAnsi="Arial" w:hint="default"/>
+      </w:rPr>
+    </w:lvl>
+    <w:lvl w:ilvl="6" w:tplc="CDD04D6E" w:tentative="1">
+      <w:start w:val="1"/>
+      <w:numFmt w:val="bullet"/>
+      <w:lvlText w:val="•"/>
+      <w:lvlJc w:val="left"/>
+      <w:pPr>
+        <w:tabs>
+          <w:tab w:val="num" w:pos="4680"/>
+        </w:tabs>
+        <w:ind w:left="4680" w:hanging="360"/>
+      </w:pPr>
+      <w:rPr>
+        <w:rFonts w:ascii="Arial" w:hAnsi="Arial" w:hint="default"/>
+      </w:rPr>
+    </w:lvl>
+    <w:lvl w:ilvl="7" w:tplc="C4381F0C" w:tentative="1">
+      <w:start w:val="1"/>
+      <w:numFmt w:val="bullet"/>
+      <w:lvlText w:val="•"/>
+      <w:lvlJc w:val="left"/>
+      <w:pPr>
+        <w:tabs>
+          <w:tab w:val="num" w:pos="5400"/>
+        </w:tabs>
+        <w:ind w:left="5400" w:hanging="360"/>
+      </w:pPr>
+      <w:rPr>
+        <w:rFonts w:ascii="Arial" w:hAnsi="Arial" w:hint="default"/>
+      </w:rPr>
+    </w:lvl>
+    <w:lvl w:ilvl="8" w:tplc="9970F410" w:tentative="1">
+      <w:start w:val="1"/>
+      <w:numFmt w:val="bullet"/>
+      <w:lvlText w:val="•"/>
+      <w:lvlJc w:val="left"/>
+      <w:pPr>
+        <w:tabs>
+          <w:tab w:val="num" w:pos="6120"/>
+        </w:tabs>
+        <w:ind w:left="6120" w:hanging="360"/>
+      </w:pPr>
+      <w:rPr>
+        <w:rFonts w:ascii="Arial" w:hAnsi="Arial" w:hint="default"/>
+      </w:rPr>
+    </w:lvl>
+  </w:abstractNum>
+  <w:abstractNum w:abstractNumId="4" w15:restartNumberingAfterBreak="0">
     <w:nsid w:val="24D9435B"/>
     <w:multiLevelType w:val="hybridMultilevel"/>
     <w:tmpl w:val="7804CA24"/>
@@ -1936,147 +2062,7 @@
       </w:rPr>
     </w:lvl>
   </w:abstractNum>
-  <w:abstractNum w:abstractNumId="3" w15:restartNumberingAfterBreak="0">
-    <w:nsid w:val="47F40ECF"/>
-    <w:multiLevelType w:val="hybridMultilevel"/>
-    <w:tmpl w:val="B78612E2"/>
-    <w:lvl w:ilvl="0" w:tplc="CFB4EAC4">
-      <w:start w:val="1"/>
-      <w:numFmt w:val="bullet"/>
-      <w:lvlText w:val="•"/>
-      <w:lvlJc w:val="left"/>
-      <w:pPr>
-        <w:tabs>
-          <w:tab w:val="num" w:pos="720"/>
-        </w:tabs>
-        <w:ind w:left="720" w:hanging="360"/>
-      </w:pPr>
-      <w:rPr>
-        <w:rFonts w:ascii="Arial" w:hAnsi="Arial" w:hint="default"/>
-      </w:rPr>
-    </w:lvl>
-    <w:lvl w:ilvl="1" w:tplc="285E090E" w:tentative="1">
-      <w:start w:val="1"/>
-      <w:numFmt w:val="bullet"/>
-      <w:lvlText w:val="•"/>
-      <w:lvlJc w:val="left"/>
-      <w:pPr>
-        <w:tabs>
-          <w:tab w:val="num" w:pos="1440"/>
-        </w:tabs>
-        <w:ind w:left="1440" w:hanging="360"/>
-      </w:pPr>
-      <w:rPr>
-        <w:rFonts w:ascii="Arial" w:hAnsi="Arial" w:hint="default"/>
-      </w:rPr>
-    </w:lvl>
-    <w:lvl w:ilvl="2" w:tplc="9F40D272" w:tentative="1">
-      <w:start w:val="1"/>
-      <w:numFmt w:val="bullet"/>
-      <w:lvlText w:val="•"/>
-      <w:lvlJc w:val="left"/>
-      <w:pPr>
-        <w:tabs>
-          <w:tab w:val="num" w:pos="2160"/>
-        </w:tabs>
-        <w:ind w:left="2160" w:hanging="360"/>
-      </w:pPr>
-      <w:rPr>
-        <w:rFonts w:ascii="Arial" w:hAnsi="Arial" w:hint="default"/>
-      </w:rPr>
-    </w:lvl>
-    <w:lvl w:ilvl="3" w:tplc="F4C276A8" w:tentative="1">
-      <w:start w:val="1"/>
-      <w:numFmt w:val="bullet"/>
-      <w:lvlText w:val="•"/>
-      <w:lvlJc w:val="left"/>
-      <w:pPr>
-        <w:tabs>
-          <w:tab w:val="num" w:pos="2880"/>
-        </w:tabs>
-        <w:ind w:left="2880" w:hanging="360"/>
-      </w:pPr>
-      <w:rPr>
-        <w:rFonts w:ascii="Arial" w:hAnsi="Arial" w:hint="default"/>
-      </w:rPr>
-    </w:lvl>
-    <w:lvl w:ilvl="4" w:tplc="7C6A7444" w:tentative="1">
-      <w:start w:val="1"/>
-      <w:numFmt w:val="bullet"/>
-      <w:lvlText w:val="•"/>
-      <w:lvlJc w:val="left"/>
-      <w:pPr>
-        <w:tabs>
-          <w:tab w:val="num" w:pos="3600"/>
-        </w:tabs>
-        <w:ind w:left="3600" w:hanging="360"/>
-      </w:pPr>
-      <w:rPr>
-        <w:rFonts w:ascii="Arial" w:hAnsi="Arial" w:hint="default"/>
-      </w:rPr>
-    </w:lvl>
-    <w:lvl w:ilvl="5" w:tplc="AEBC1962" w:tentative="1">
-      <w:start w:val="1"/>
-      <w:numFmt w:val="bullet"/>
-      <w:lvlText w:val="•"/>
-      <w:lvlJc w:val="left"/>
-      <w:pPr>
-        <w:tabs>
-          <w:tab w:val="num" w:pos="4320"/>
-        </w:tabs>
-        <w:ind w:left="4320" w:hanging="360"/>
-      </w:pPr>
-      <w:rPr>
-        <w:rFonts w:ascii="Arial" w:hAnsi="Arial" w:hint="default"/>
-      </w:rPr>
-    </w:lvl>
-    <w:lvl w:ilvl="6" w:tplc="030E6F2E" w:tentative="1">
-      <w:start w:val="1"/>
-      <w:numFmt w:val="bullet"/>
-      <w:lvlText w:val="•"/>
-      <w:lvlJc w:val="left"/>
-      <w:pPr>
-        <w:tabs>
-          <w:tab w:val="num" w:pos="5040"/>
-        </w:tabs>
-        <w:ind w:left="5040" w:hanging="360"/>
-      </w:pPr>
-      <w:rPr>
-        <w:rFonts w:ascii="Arial" w:hAnsi="Arial" w:hint="default"/>
-      </w:rPr>
-    </w:lvl>
-    <w:lvl w:ilvl="7" w:tplc="D3307516" w:tentative="1">
-      <w:start w:val="1"/>
-      <w:numFmt w:val="bullet"/>
-      <w:lvlText w:val="•"/>
-      <w:lvlJc w:val="left"/>
-      <w:pPr>
-        <w:tabs>
-          <w:tab w:val="num" w:pos="5760"/>
-        </w:tabs>
-        <w:ind w:left="5760" w:hanging="360"/>
-      </w:pPr>
-      <w:rPr>
-        <w:rFonts w:ascii="Arial" w:hAnsi="Arial" w:hint="default"/>
-      </w:rPr>
-    </w:lvl>
-    <w:lvl w:ilvl="8" w:tplc="30046122" w:tentative="1">
-      <w:start w:val="1"/>
-      <w:numFmt w:val="bullet"/>
-      <w:lvlText w:val="•"/>
-      <w:lvlJc w:val="left"/>
-      <w:pPr>
-        <w:tabs>
-          <w:tab w:val="num" w:pos="6480"/>
-        </w:tabs>
-        <w:ind w:left="6480" w:hanging="360"/>
-      </w:pPr>
-      <w:rPr>
-        <w:rFonts w:ascii="Arial" w:hAnsi="Arial" w:hint="default"/>
-      </w:rPr>
-    </w:lvl>
-  </w:abstractNum>
-  <w:abstractNum w:abstractNumId="4" w15:restartNumberingAfterBreak="0">
+  <w:abstractNum w:abstractNumId="5" w15:restartNumberingAfterBreak="0">
     <w:nsid w:val="55573883"/>
     <w:multiLevelType w:val="hybridMultilevel"/>
     <w:tmpl w:val="577CB034"/>
@@ -2217,19 +2203,22 @@
     </w:lvl>
   </w:abstractNum>
   <w:num w:numId="1" w16cid:durableId="1042680201">
-    <w:abstractNumId w:val="1"/>
+    <w:abstractNumId w:val="0"/>
   </w:num>
   <w:num w:numId="2" w16cid:durableId="463889055">
+    <w:abstractNumId w:val="5"/>
+  </w:num>
+  <w:num w:numId="3" w16cid:durableId="1488671833">
     <w:abstractNumId w:val="4"/>
   </w:num>
-  <w:num w:numId="3" w16cid:durableId="1488671833">
+  <w:num w:numId="4" w16cid:durableId="1967733154">
     <w:abstractNumId w:val="2"/>
   </w:num>
-  <w:num w:numId="4" w16cid:durableId="1980257944">
+  <w:num w:numId="5" w16cid:durableId="1484348300">
     <w:abstractNumId w:val="3"/>
   </w:num>
-  <w:num w:numId="5" w16cid:durableId="1433361295">
-    <w:abstractNumId w:val="0"/>
+  <w:num w:numId="6" w16cid:durableId="932275527">
+    <w:abstractNumId w:val="1"/>
   </w:num>
 </w:numbering>
 </file>

</xml_diff>